<commit_message>
Polish and verify Assignment 2 submission
</commit_message>
<xml_diff>
--- a/deliverables/Cai_Yufei_Assignment2_Creation_Agent_Record.docx
+++ b/deliverables/Cai_Yufei_Assignment2_Creation_Agent_Record.docx
@@ -900,6 +900,7 @@
     <w:p>
       <w:pPr>
         <w:pStyle w:val="Heading1"/>
+        <w:spacing w:before="360"/>
       </w:pPr>
       <w:r>
         <w:t>C. Three-Level Finding</w:t>
@@ -1018,7 +1019,7 @@
               <w:spacing w:after="20"/>
             </w:pPr>
             <w:r>
-              <w:t>Agentic AI is a cumulative recombination rather than a single invention. Transformer models, few-shot language interaction, instruction following, reasoning-action loops, learned tool use, open integration protocols, and packaged orchestration infrastructure collectively enabled systems in which a model manages multi-step work and selects tools. This convergence statement is an inference grounded in dated milestones. By 2026, the category had moved from research demonstrations to packaged infrastructure and reported deployments, but public-beta platforms and changing interfaces showed that architecture and assurance remained unsettled.</w:t>
+              <w:t>Agentic AI is best understood as a cumulative recombination rather than a single invention. Transformer models, few-shot language interaction, instruction following, reasoning-action loops, learned tool use, an open integration protocol, market demand for contextual workflows, and packaged orchestration infrastructure collectively enabled systems in which a model can manage multi-step work and select tools. This convergence statement is an inference grounded in dated milestones. By 2026, the category has progressed from research demonstrations to packaged infrastructure and provider-reported deployments, but public-beta platforms and changing interfaces show that architecture and assurance remain unsettled.</w:t>
             </w:r>
           </w:p>
         </w:tc>
@@ -1687,6 +1688,7 @@
     <w:p>
       <w:pPr>
         <w:pStyle w:val="Heading1"/>
+        <w:spacing w:before="360"/>
       </w:pPr>
       <w:r>
         <w:t>E. Independent Judgment and Handoff</w:t>
@@ -1910,6 +1912,7 @@
     <w:p>
       <w:pPr>
         <w:pStyle w:val="Heading1"/>
+        <w:spacing w:before="360"/>
       </w:pPr>
       <w:r>
         <w:t>F. Self Reflection</w:t>

</xml_diff>